<commit_message>
docs: synchronize lakehouse schemas, medallion terminology, and visual architecture diagrams
- Render 2x DPI Retina PNGs and vector SVGs for Architecture, Star Schema, and Watchtower Dashboard
- Synchronize table names to bronze_ooni_raw and silver_network_measurements across all documentation
- Standardize audit columns to load_timestamp, _source_file, _batch_id, and _corrupt_record
- Align Silver schema definitions for probe_asn (Long), masked_probe_subnet, hashed_resolver_ip, and http_anomaly_flag
- Update phase1_proposal.docx with latest figures, verified volume sizing table, and synchronized text
</commit_message>
<xml_diff>
--- a/Docs/.docx/phase1_proposal.docx
+++ b/Docs/.docx/phase1_proposal.docx
@@ -658,16 +658,18 @@
               <w:bottom w:w="80" w:type="dxa"/>
               <w:right w:w="100" w:type="dxa"/>
             </w:tcMar>
+            <w:shd w:fill="0F172A"/>
           </w:tcPr>
           <w:p>
             <w:pPr>
-              <w:spacing w:after="40"/>
+              <w:spacing w:before="60" w:after="60" w:line="252" w:lineRule="auto"/>
             </w:pPr>
             <w:r>
               <w:rPr>
+                <w:rFonts w:ascii="Calibri" w:hAnsi="Calibri"/>
                 <w:b/>
                 <w:color w:val="FFFFFF"/>
-                <w:sz w:val="19"/>
+                <w:sz w:val="20"/>
               </w:rPr>
               <w:t>Metric Category</w:t>
             </w:r>
@@ -683,18 +685,20 @@
               <w:bottom w:w="80" w:type="dxa"/>
               <w:right w:w="100" w:type="dxa"/>
             </w:tcMar>
+            <w:shd w:fill="0F172A"/>
           </w:tcPr>
           <w:p>
             <w:pPr>
-              <w:spacing w:after="40"/>
+              <w:spacing w:before="60" w:after="60" w:line="252" w:lineRule="auto"/>
             </w:pPr>
             <w:r>
               <w:rPr>
+                <w:rFonts w:ascii="Calibri" w:hAnsi="Calibri"/>
                 <w:b/>
                 <w:color w:val="FFFFFF"/>
-                <w:sz w:val="19"/>
+                <w:sz w:val="20"/>
               </w:rPr>
-              <w:t>Full Load Baseline</w:t>
+              <w:t>Full Load Baseline (5-7 Day Focus)</w:t>
             </w:r>
           </w:p>
         </w:tc>
@@ -708,18 +712,20 @@
               <w:bottom w:w="80" w:type="dxa"/>
               <w:right w:w="100" w:type="dxa"/>
             </w:tcMar>
+            <w:shd w:fill="0F172A"/>
           </w:tcPr>
           <w:p>
             <w:pPr>
-              <w:spacing w:after="40"/>
+              <w:spacing w:before="60" w:after="60" w:line="252" w:lineRule="auto"/>
             </w:pPr>
             <w:r>
               <w:rPr>
+                <w:rFonts w:ascii="Calibri" w:hAnsi="Calibri"/>
                 <w:b/>
                 <w:color w:val="FFFFFF"/>
-                <w:sz w:val="19"/>
+                <w:sz w:val="20"/>
               </w:rPr>
-              <w:t>Daily Incremental Load</w:t>
+              <w:t>Daily Incremental Load (3-Day Lookback)</w:t>
             </w:r>
           </w:p>
         </w:tc>
@@ -733,16 +739,18 @@
               <w:bottom w:w="80" w:type="dxa"/>
               <w:right w:w="100" w:type="dxa"/>
             </w:tcMar>
+            <w:shd w:fill="0F172A"/>
           </w:tcPr>
           <w:p>
             <w:pPr>
-              <w:spacing w:after="40"/>
+              <w:spacing w:before="60" w:after="60" w:line="252" w:lineRule="auto"/>
             </w:pPr>
             <w:r>
               <w:rPr>
+                <w:rFonts w:ascii="Calibri" w:hAnsi="Calibri"/>
                 <w:b/>
                 <w:color w:val="FFFFFF"/>
-                <w:sz w:val="19"/>
+                <w:sz w:val="20"/>
               </w:rPr>
               <w:t>Monthly Projected Volume</w:t>
             </w:r>
@@ -750,126 +758,180 @@
         </w:tc>
       </w:tr>
       <w:tr>
-        <w:trPr>
-          <w:jc w:val="center"/>
-        </w:trPr>
         <w:tc>
           <w:tcPr>
-            <w:tcW w:w="2340" w:type="dxa"/>
-            <w:shd w:val="clear" w:color="auto" w:fill="FFFFFF"/>
-            <w:tcMar>
-              <w:top w:w="60" w:type="dxa"/>
-              <w:left w:w="100" w:type="dxa"/>
-              <w:bottom w:w="60" w:type="dxa"/>
-              <w:right w:w="100" w:type="dxa"/>
-            </w:tcMar>
+            <w:tcW w:type="dxa" w:w="2340"/>
+            <w:shd w:fill="FFFFFF"/>
           </w:tcPr>
           <w:p>
             <w:pPr>
-              <w:spacing w:after="40"/>
+              <w:spacing w:before="60" w:after="60" w:line="252" w:lineRule="auto"/>
             </w:pPr>
             <w:r>
               <w:rPr>
-                <w:b/>
-                <w:sz w:val="18"/>
+                <w:rFonts w:ascii="Calibri" w:hAnsi="Calibri"/>
+                <w:color w:val="1E293B"/>
+                <w:sz w:val="19"/>
               </w:rPr>
-              <w:t>Raw File Size (JSON)</w:t>
+              <w:t>Compressed S3 Archive (.gz)</w:t>
             </w:r>
           </w:p>
         </w:tc>
         <w:tc>
           <w:tcPr>
-            <w:tcW w:w="2340" w:type="dxa"/>
-            <w:shd w:val="clear" w:color="auto" w:fill="FFFFFF"/>
-            <w:tcMar>
-              <w:top w:w="60" w:type="dxa"/>
-              <w:left w:w="100" w:type="dxa"/>
-              <w:bottom w:w="60" w:type="dxa"/>
-              <w:right w:w="100" w:type="dxa"/>
-            </w:tcMar>
+            <w:tcW w:type="dxa" w:w="2340"/>
+            <w:shd w:fill="FFFFFF"/>
           </w:tcPr>
           <w:p>
             <w:pPr>
-              <w:spacing w:after="40"/>
+              <w:spacing w:before="60" w:after="60" w:line="252" w:lineRule="auto"/>
             </w:pPr>
             <w:r>
               <w:rPr>
-                <w:sz w:val="18"/>
+                <w:rFonts w:ascii="Calibri" w:hAnsi="Calibri"/>
+                <w:color w:val="1E293B"/>
+                <w:sz w:val="19"/>
               </w:rPr>
-              <w:t>9.8 GB to 10.5 GB</w:t>
+              <w:t>~400 MB to 600 MB</w:t>
             </w:r>
           </w:p>
         </w:tc>
         <w:tc>
           <w:tcPr>
-            <w:tcW w:w="2340" w:type="dxa"/>
-            <w:shd w:val="clear" w:color="auto" w:fill="FFFFFF"/>
-            <w:tcMar>
-              <w:top w:w="60" w:type="dxa"/>
-              <w:left w:w="100" w:type="dxa"/>
-              <w:bottom w:w="60" w:type="dxa"/>
-              <w:right w:w="100" w:type="dxa"/>
-            </w:tcMar>
+            <w:tcW w:type="dxa" w:w="2340"/>
+            <w:shd w:fill="FFFFFF"/>
           </w:tcPr>
           <w:p>
             <w:pPr>
-              <w:spacing w:after="40"/>
+              <w:spacing w:before="60" w:after="60" w:line="252" w:lineRule="auto"/>
             </w:pPr>
             <w:r>
               <w:rPr>
-                <w:sz w:val="18"/>
+                <w:rFonts w:ascii="Calibri" w:hAnsi="Calibri"/>
+                <w:color w:val="1E293B"/>
+                <w:sz w:val="19"/>
               </w:rPr>
-              <w:t>1.6 GB to 2.1 GB / day</w:t>
+              <w:t>~25 MB to 50 MB / day</w:t>
             </w:r>
           </w:p>
         </w:tc>
         <w:tc>
           <w:tcPr>
-            <w:tcW w:w="2340" w:type="dxa"/>
-            <w:shd w:val="clear" w:color="auto" w:fill="FFFFFF"/>
-            <w:tcMar>
-              <w:top w:w="60" w:type="dxa"/>
-              <w:left w:w="100" w:type="dxa"/>
-              <w:bottom w:w="60" w:type="dxa"/>
-              <w:right w:w="100" w:type="dxa"/>
-            </w:tcMar>
+            <w:tcW w:type="dxa" w:w="2340"/>
+            <w:shd w:fill="FFFFFF"/>
           </w:tcPr>
           <w:p>
             <w:pPr>
-              <w:spacing w:after="40"/>
+              <w:spacing w:before="60" w:after="60" w:line="252" w:lineRule="auto"/>
             </w:pPr>
             <w:r>
               <w:rPr>
-                <w:sz w:val="18"/>
+                <w:rFonts w:ascii="Calibri" w:hAnsi="Calibri"/>
+                <w:color w:val="1E293B"/>
+                <w:sz w:val="19"/>
               </w:rPr>
-              <w:t>~50 GB to 65 GB</w:t>
+              <w:t>~1.0 GB to 1.5 GB</w:t>
             </w:r>
           </w:p>
         </w:tc>
       </w:tr>
       <w:tr>
-        <w:trPr>
-          <w:jc w:val="center"/>
-        </w:trPr>
         <w:tc>
           <w:tcPr>
-            <w:tcW w:w="2340" w:type="dxa"/>
-            <w:shd w:val="clear" w:color="auto" w:fill="F9FBFD"/>
-            <w:tcMar>
-              <w:top w:w="60" w:type="dxa"/>
-              <w:left w:w="100" w:type="dxa"/>
-              <w:bottom w:w="60" w:type="dxa"/>
-              <w:right w:w="100" w:type="dxa"/>
-            </w:tcMar>
+            <w:tcW w:type="dxa" w:w="2340"/>
+            <w:shd w:fill="FFFFFF"/>
+            <w:shd w:fill="F8FAFC"/>
           </w:tcPr>
           <w:p>
             <w:pPr>
-              <w:spacing w:after="40"/>
+              <w:spacing w:before="60" w:after="60" w:line="252" w:lineRule="auto"/>
             </w:pPr>
             <w:r>
               <w:rPr>
-                <w:b/>
-                <w:sz w:val="18"/>
+                <w:rFonts w:ascii="Calibri" w:hAnsi="Calibri"/>
+                <w:color w:val="1E293B"/>
+                <w:sz w:val="19"/>
+              </w:rPr>
+              <w:t>Uncompressed Raw JSON Text</w:t>
+            </w:r>
+          </w:p>
+        </w:tc>
+        <w:tc>
+          <w:tcPr>
+            <w:tcW w:type="dxa" w:w="2340"/>
+            <w:shd w:fill="FFFFFF"/>
+            <w:shd w:fill="F8FAFC"/>
+          </w:tcPr>
+          <w:p>
+            <w:pPr>
+              <w:spacing w:before="60" w:after="60" w:line="252" w:lineRule="auto"/>
+            </w:pPr>
+            <w:r>
+              <w:rPr>
+                <w:rFonts w:ascii="Calibri" w:hAnsi="Calibri"/>
+                <w:color w:val="1E293B"/>
+                <w:sz w:val="19"/>
+              </w:rPr>
+              <w:t>~2.2 GB to 3.2 GB</w:t>
+            </w:r>
+          </w:p>
+        </w:tc>
+        <w:tc>
+          <w:tcPr>
+            <w:tcW w:type="dxa" w:w="2340"/>
+            <w:shd w:fill="FFFFFF"/>
+            <w:shd w:fill="F8FAFC"/>
+          </w:tcPr>
+          <w:p>
+            <w:pPr>
+              <w:spacing w:before="60" w:after="60" w:line="252" w:lineRule="auto"/>
+            </w:pPr>
+            <w:r>
+              <w:rPr>
+                <w:rFonts w:ascii="Calibri" w:hAnsi="Calibri"/>
+                <w:color w:val="1E293B"/>
+                <w:sz w:val="19"/>
+              </w:rPr>
+              <w:t>~140 MB to 270 MB / day</w:t>
+            </w:r>
+          </w:p>
+        </w:tc>
+        <w:tc>
+          <w:tcPr>
+            <w:tcW w:type="dxa" w:w="2340"/>
+            <w:shd w:fill="FFFFFF"/>
+            <w:shd w:fill="F8FAFC"/>
+          </w:tcPr>
+          <w:p>
+            <w:pPr>
+              <w:spacing w:before="60" w:after="60" w:line="252" w:lineRule="auto"/>
+            </w:pPr>
+            <w:r>
+              <w:rPr>
+                <w:rFonts w:ascii="Calibri" w:hAnsi="Calibri"/>
+                <w:color w:val="1E293B"/>
+                <w:sz w:val="19"/>
+              </w:rPr>
+              <w:t>~5.5 GB to 8.0 GB</w:t>
+            </w:r>
+          </w:p>
+        </w:tc>
+      </w:tr>
+      <w:tr>
+        <w:tc>
+          <w:tcPr>
+            <w:tcW w:type="dxa" w:w="2340"/>
+            <w:shd w:fill="FFFFFF"/>
+          </w:tcPr>
+          <w:p>
+            <w:pPr>
+              <w:spacing w:before="60" w:after="60" w:line="252" w:lineRule="auto"/>
+            </w:pPr>
+            <w:r>
+              <w:rPr>
+                <w:rFonts w:ascii="Calibri" w:hAnsi="Calibri"/>
+                <w:color w:val="1E293B"/>
+                <w:sz w:val="19"/>
               </w:rPr>
               <w:t>Record Count (Rows)</w:t>
             </w:r>
@@ -877,195 +939,159 @@
         </w:tc>
         <w:tc>
           <w:tcPr>
-            <w:tcW w:w="2340" w:type="dxa"/>
-            <w:shd w:val="clear" w:color="auto" w:fill="F9FBFD"/>
-            <w:tcMar>
-              <w:top w:w="60" w:type="dxa"/>
-              <w:left w:w="100" w:type="dxa"/>
-              <w:bottom w:w="60" w:type="dxa"/>
-              <w:right w:w="100" w:type="dxa"/>
-            </w:tcMar>
+            <w:tcW w:type="dxa" w:w="2340"/>
+            <w:shd w:fill="FFFFFF"/>
           </w:tcPr>
           <w:p>
             <w:pPr>
-              <w:spacing w:after="40"/>
+              <w:spacing w:before="60" w:after="60" w:line="252" w:lineRule="auto"/>
             </w:pPr>
             <w:r>
               <w:rPr>
-                <w:sz w:val="18"/>
+                <w:rFonts w:ascii="Calibri" w:hAnsi="Calibri"/>
+                <w:color w:val="1E293B"/>
+                <w:sz w:val="19"/>
               </w:rPr>
-              <w:t>~12,000,000 to 15,000,000</w:t>
+              <w:t>~35,000 to 60,000 measurements</w:t>
             </w:r>
           </w:p>
         </w:tc>
         <w:tc>
           <w:tcPr>
-            <w:tcW w:w="2340" w:type="dxa"/>
-            <w:shd w:val="clear" w:color="auto" w:fill="F9FBFD"/>
-            <w:tcMar>
-              <w:top w:w="60" w:type="dxa"/>
-              <w:left w:w="100" w:type="dxa"/>
-              <w:bottom w:w="60" w:type="dxa"/>
-              <w:right w:w="100" w:type="dxa"/>
-            </w:tcMar>
+            <w:tcW w:type="dxa" w:w="2340"/>
+            <w:shd w:fill="FFFFFF"/>
           </w:tcPr>
           <w:p>
             <w:pPr>
-              <w:spacing w:after="40"/>
+              <w:spacing w:before="60" w:after="60" w:line="252" w:lineRule="auto"/>
             </w:pPr>
             <w:r>
               <w:rPr>
-                <w:sz w:val="18"/>
+                <w:rFonts w:ascii="Calibri" w:hAnsi="Calibri"/>
+                <w:color w:val="1E293B"/>
+                <w:sz w:val="19"/>
               </w:rPr>
-              <w:t>~2,000,000 to 2,800,000</w:t>
+              <w:t>~2,000 to 5,000 / day</w:t>
             </w:r>
           </w:p>
         </w:tc>
         <w:tc>
           <w:tcPr>
-            <w:tcW w:w="2340" w:type="dxa"/>
-            <w:shd w:val="clear" w:color="auto" w:fill="F9FBFD"/>
-            <w:tcMar>
-              <w:top w:w="60" w:type="dxa"/>
-              <w:left w:w="100" w:type="dxa"/>
-              <w:bottom w:w="60" w:type="dxa"/>
-              <w:right w:w="100" w:type="dxa"/>
-            </w:tcMar>
+            <w:tcW w:type="dxa" w:w="2340"/>
+            <w:shd w:fill="FFFFFF"/>
           </w:tcPr>
           <w:p>
             <w:pPr>
-              <w:spacing w:after="40"/>
+              <w:spacing w:before="60" w:after="60" w:line="252" w:lineRule="auto"/>
             </w:pPr>
             <w:r>
               <w:rPr>
-                <w:sz w:val="18"/>
+                <w:rFonts w:ascii="Calibri" w:hAnsi="Calibri"/>
+                <w:color w:val="1E293B"/>
+                <w:sz w:val="19"/>
               </w:rPr>
-              <w:t>~75,000,000</w:t>
+              <w:t>~90,000 to 150,000</w:t>
             </w:r>
           </w:p>
         </w:tc>
       </w:tr>
       <w:tr>
-        <w:trPr>
-          <w:jc w:val="center"/>
-        </w:trPr>
         <w:tc>
           <w:tcPr>
-            <w:tcW w:w="2340" w:type="dxa"/>
-            <w:shd w:val="clear" w:color="auto" w:fill="FFFFFF"/>
-            <w:tcMar>
-              <w:top w:w="60" w:type="dxa"/>
-              <w:left w:w="100" w:type="dxa"/>
-              <w:bottom w:w="60" w:type="dxa"/>
-              <w:right w:w="100" w:type="dxa"/>
-            </w:tcMar>
+            <w:tcW w:type="dxa" w:w="2340"/>
+            <w:shd w:fill="FFFFFF"/>
+            <w:shd w:fill="F8FAFC"/>
           </w:tcPr>
           <w:p>
             <w:pPr>
-              <w:spacing w:after="40"/>
+              <w:spacing w:before="60" w:after="60" w:line="252" w:lineRule="auto"/>
             </w:pPr>
             <w:r>
               <w:rPr>
-                <w:b/>
-                <w:sz w:val="18"/>
+                <w:rFonts w:ascii="Calibri" w:hAnsi="Calibri"/>
+                <w:color w:val="1E293B"/>
+                <w:sz w:val="19"/>
               </w:rPr>
-              <w:t>Delta Compressed Size</w:t>
+              <w:t>Delta Lake Compressed Size</w:t>
             </w:r>
           </w:p>
         </w:tc>
         <w:tc>
           <w:tcPr>
-            <w:tcW w:w="2340" w:type="dxa"/>
-            <w:shd w:val="clear" w:color="auto" w:fill="FFFFFF"/>
-            <w:tcMar>
-              <w:top w:w="60" w:type="dxa"/>
-              <w:left w:w="100" w:type="dxa"/>
-              <w:bottom w:w="60" w:type="dxa"/>
-              <w:right w:w="100" w:type="dxa"/>
-            </w:tcMar>
+            <w:tcW w:type="dxa" w:w="2340"/>
+            <w:shd w:fill="FFFFFF"/>
+            <w:shd w:fill="F8FAFC"/>
           </w:tcPr>
           <w:p>
             <w:pPr>
-              <w:spacing w:after="40"/>
+              <w:spacing w:before="60" w:after="60" w:line="252" w:lineRule="auto"/>
             </w:pPr>
             <w:r>
               <w:rPr>
-                <w:sz w:val="18"/>
+                <w:rFonts w:ascii="Calibri" w:hAnsi="Calibri"/>
+                <w:color w:val="1E293B"/>
+                <w:sz w:val="19"/>
               </w:rPr>
-              <w:t>~1.9 GB to 2.3 GB</w:t>
+              <w:t>~80 MB to 130 MB</w:t>
             </w:r>
           </w:p>
         </w:tc>
         <w:tc>
           <w:tcPr>
-            <w:tcW w:w="2340" w:type="dxa"/>
-            <w:shd w:val="clear" w:color="auto" w:fill="FFFFFF"/>
-            <w:tcMar>
-              <w:top w:w="60" w:type="dxa"/>
-              <w:left w:w="100" w:type="dxa"/>
-              <w:bottom w:w="60" w:type="dxa"/>
-              <w:right w:w="100" w:type="dxa"/>
-            </w:tcMar>
+            <w:tcW w:type="dxa" w:w="2340"/>
+            <w:shd w:fill="FFFFFF"/>
+            <w:shd w:fill="F8FAFC"/>
           </w:tcPr>
           <w:p>
             <w:pPr>
-              <w:spacing w:after="40"/>
+              <w:spacing w:before="60" w:after="60" w:line="252" w:lineRule="auto"/>
             </w:pPr>
             <w:r>
               <w:rPr>
-                <w:sz w:val="18"/>
+                <w:rFonts w:ascii="Calibri" w:hAnsi="Calibri"/>
+                <w:color w:val="1E293B"/>
+                <w:sz w:val="19"/>
               </w:rPr>
-              <w:t>~350 MB to 450 MB / day</w:t>
+              <w:t>~5 MB to 10 MB / day</w:t>
             </w:r>
           </w:p>
         </w:tc>
         <w:tc>
           <w:tcPr>
-            <w:tcW w:w="2340" w:type="dxa"/>
-            <w:shd w:val="clear" w:color="auto" w:fill="FFFFFF"/>
-            <w:tcMar>
-              <w:top w:w="60" w:type="dxa"/>
-              <w:left w:w="100" w:type="dxa"/>
-              <w:bottom w:w="60" w:type="dxa"/>
-              <w:right w:w="100" w:type="dxa"/>
-            </w:tcMar>
+            <w:tcW w:type="dxa" w:w="2340"/>
+            <w:shd w:fill="FFFFFF"/>
+            <w:shd w:fill="F8FAFC"/>
           </w:tcPr>
           <w:p>
             <w:pPr>
-              <w:spacing w:after="40"/>
+              <w:spacing w:before="60" w:after="60" w:line="252" w:lineRule="auto"/>
             </w:pPr>
             <w:r>
               <w:rPr>
-                <w:sz w:val="18"/>
+                <w:rFonts w:ascii="Calibri" w:hAnsi="Calibri"/>
+                <w:color w:val="1E293B"/>
+                <w:sz w:val="19"/>
               </w:rPr>
-              <w:t>~11 GB to 13 GB</w:t>
+              <w:t>~250 MB to 350 MB</w:t>
             </w:r>
           </w:p>
         </w:tc>
       </w:tr>
       <w:tr>
-        <w:trPr>
-          <w:jc w:val="center"/>
-        </w:trPr>
         <w:tc>
           <w:tcPr>
-            <w:tcW w:w="2340" w:type="dxa"/>
-            <w:shd w:val="clear" w:color="auto" w:fill="F9FBFD"/>
-            <w:tcMar>
-              <w:top w:w="60" w:type="dxa"/>
-              <w:left w:w="100" w:type="dxa"/>
-              <w:bottom w:w="60" w:type="dxa"/>
-              <w:right w:w="100" w:type="dxa"/>
-            </w:tcMar>
+            <w:tcW w:type="dxa" w:w="2340"/>
+            <w:shd w:fill="FFFFFF"/>
           </w:tcPr>
           <w:p>
             <w:pPr>
-              <w:spacing w:after="40"/>
+              <w:spacing w:before="60" w:after="60" w:line="252" w:lineRule="auto"/>
             </w:pPr>
             <w:r>
               <w:rPr>
-                <w:b/>
-                <w:sz w:val="18"/>
+                <w:rFonts w:ascii="Calibri" w:hAnsi="Calibri"/>
+                <w:color w:val="1E293B"/>
+                <w:sz w:val="19"/>
               </w:rPr>
               <w:t>Ingestion Cadence</w:t>
             </w:r>
@@ -1073,68 +1099,56 @@
         </w:tc>
         <w:tc>
           <w:tcPr>
-            <w:tcW w:w="2340" w:type="dxa"/>
-            <w:shd w:val="clear" w:color="auto" w:fill="F9FBFD"/>
-            <w:tcMar>
-              <w:top w:w="60" w:type="dxa"/>
-              <w:left w:w="100" w:type="dxa"/>
-              <w:bottom w:w="60" w:type="dxa"/>
-              <w:right w:w="100" w:type="dxa"/>
-            </w:tcMar>
+            <w:tcW w:type="dxa" w:w="2340"/>
+            <w:shd w:fill="FFFFFF"/>
           </w:tcPr>
           <w:p>
             <w:pPr>
-              <w:spacing w:after="40"/>
+              <w:spacing w:before="60" w:after="60" w:line="252" w:lineRule="auto"/>
             </w:pPr>
             <w:r>
               <w:rPr>
-                <w:sz w:val="18"/>
+                <w:rFonts w:ascii="Calibri" w:hAnsi="Calibri"/>
+                <w:color w:val="1E293B"/>
+                <w:sz w:val="19"/>
               </w:rPr>
-              <w:t>One-time initial bootstrap</w:t>
+              <w:t>One-time initial historical bootstrap</w:t>
             </w:r>
           </w:p>
         </w:tc>
         <w:tc>
           <w:tcPr>
-            <w:tcW w:w="2340" w:type="dxa"/>
-            <w:shd w:val="clear" w:color="auto" w:fill="F9FBFD"/>
-            <w:tcMar>
-              <w:top w:w="60" w:type="dxa"/>
-              <w:left w:w="100" w:type="dxa"/>
-              <w:bottom w:w="60" w:type="dxa"/>
-              <w:right w:w="100" w:type="dxa"/>
-            </w:tcMar>
+            <w:tcW w:type="dxa" w:w="2340"/>
+            <w:shd w:fill="FFFFFF"/>
           </w:tcPr>
           <w:p>
             <w:pPr>
-              <w:spacing w:after="40"/>
+              <w:spacing w:before="60" w:after="60" w:line="252" w:lineRule="auto"/>
             </w:pPr>
             <w:r>
               <w:rPr>
-                <w:sz w:val="18"/>
+                <w:rFonts w:ascii="Calibri" w:hAnsi="Calibri"/>
+                <w:color w:val="1E293B"/>
+                <w:sz w:val="19"/>
               </w:rPr>
-              <w:t>Daily micro-batch (24h window)</w:t>
+              <w:t>Daily scheduled micro-batch (T-3 to T)</w:t>
             </w:r>
           </w:p>
         </w:tc>
         <w:tc>
           <w:tcPr>
-            <w:tcW w:w="2340" w:type="dxa"/>
-            <w:shd w:val="clear" w:color="auto" w:fill="F9FBFD"/>
-            <w:tcMar>
-              <w:top w:w="60" w:type="dxa"/>
-              <w:left w:w="100" w:type="dxa"/>
-              <w:bottom w:w="60" w:type="dxa"/>
-              <w:right w:w="100" w:type="dxa"/>
-            </w:tcMar>
+            <w:tcW w:type="dxa" w:w="2340"/>
+            <w:shd w:fill="FFFFFF"/>
           </w:tcPr>
           <w:p>
             <w:pPr>
-              <w:spacing w:after="40"/>
+              <w:spacing w:before="60" w:after="60" w:line="252" w:lineRule="auto"/>
             </w:pPr>
             <w:r>
               <w:rPr>
-                <w:sz w:val="18"/>
+                <w:rFonts w:ascii="Calibri" w:hAnsi="Calibri"/>
+                <w:color w:val="1E293B"/>
+                <w:sz w:val="19"/>
               </w:rPr>
               <w:t>Continuous scheduled cron</w:t>
             </w:r>
@@ -1426,14 +1440,10 @@
     <w:p>
       <w:r>
         <w:t>• Direct, unaltered append-only ingestion of source JSON and CSV payloads.</w:t>
-      </w:r>
-      <w:r>
         <w:br/>
-        <w:t>• Ingestion metadata attached: _ingestion_timestamp, _source_file_name, and _batch_run_id for complete data provenance and idempotency auditing.</w:t>
-      </w:r>
-      <w:r>
+        <w:t>• Table Name: bronze_ooni_raw (Delta Lake table with default Snappy compression).</w:t>
         <w:br/>
-        <w:t>• Stored as Delta Lake tables with default Snappy compression.</w:t>
+        <w:t>• Ingestion metadata attached: load_timestamp (UTC timestamp), _source_file (provenance tracking), _batch_id (unique execution identifier), and _corrupt_record (quarantine capture under PERMISSIVE mode) for complete data provenance and idempotency auditing.</w:t>
       </w:r>
     </w:p>
     <w:p>
@@ -1452,23 +1462,19 @@
     </w:p>
     <w:p>
       <w:r>
-        <w:t>• Schema Standardization: Casting heterogeneous JSON data types into strong PySpark types (measurement_start_time -&gt; TimestampType, probe_asn -&gt; StringType).</w:t>
-      </w:r>
-      <w:r>
+        <w:t>• Target Table: silver_network_measurements (Cleansed, Conformed &amp; Enriched).</w:t>
         <w:br/>
-        <w:t>• JSON Array Exploding: Flattening nested network test arrays (test_keys.queries, test_keys.network_events, and test_keys.tcp_connects) into relational tabular rows.</w:t>
-      </w:r>
-      <w:r>
+        <w:t>• Schema Standardization: Casting heterogeneous JSON data types into strong PySpark types (event_timestamp -&gt; TimestampType, measurement_date -&gt; DateType, probe_asn -&gt; LongType).</w:t>
         <w:br/>
-        <w:t>• Multi-Source Joining: Broadcast joins with ref_citizenlab_categories on target domain and lookup joins with ref_asn_providers on probe_asn.</w:t>
-      </w:r>
-      <w:r>
+        <w:t>• PII Sanitization: Salting and hashing resolver IPs via HMAC-SHA256 (hashed_resolver_ip), truncating client IPs to /24 subnets (masked_probe_subnet), and stripping auth tokens from URLs (target_url).</w:t>
         <w:br/>
-        <w:t>• Tampering Vector Classification Engine: Evaluates raw network error codes into clean categories: DNS_TAMPERING, TCP_RESET_INJECTION, TLS_HANDSHAKE_DROP, and HTTP_BLOCK_PAGE.</w:t>
-      </w:r>
-      <w:r>
+        <w:t>• Two-Tier Polymorphic Parsing: test_keys is preserved as raw StringType at Bronze to accommodate the OONI union type (blocking: string | bool), then extracted at Silver via from_json() per test_name.</w:t>
         <w:br/>
-        <w:t>• Deduplication: Enforcing deduplication on measurement_id using Delta Lake merge operations.</w:t>
+        <w:t>• Multi-Source Joining: Broadcast joins with ref_citizenlab_categories on target domain to enrich content_category, category_description, and human_rights_risk_tier, plus lookup joins with ref_asn_providers on probe_asn.</w:t>
+        <w:br/>
+        <w:t>• Tampering Vector Classification Engine: Classifies network error codes into clean categories: DNS_TAMPERING, TCP_RESET, TLS_DROP, HTTP_BLOCK, and BENIGN with boolean is_anomaly and integer flags.</w:t>
+        <w:br/>
+        <w:t>• Idempotent CDC Engine: Maintained via Delta Lake MERGE INTO scanning a 3-day rolling lookback window (T-3 to T), reconciling delayed mobile probe measurements and updating enriched taxonomy with zero duplicates.</w:t>
       </w:r>
     </w:p>
     <w:p>
@@ -1488,18 +1494,12 @@
     <w:p>
       <w:r>
         <w:t>The Gold layer provides high-performance, analytics-ready tables modeled in a Star Schema optimized for analytical reporting:</w:t>
-      </w:r>
-      <w:r>
         <w:br/>
-        <w:t>• Fact Table: fact_network_anomaly (Granularity: One row per confirmed network test failure/anomaly. Measures: dns_anomaly_flag, tcp_anomaly_flag, tls_anomaly_flag, response_latency_ms).</w:t>
-      </w:r>
-      <w:r>
+        <w:t>• Fact Table: fact_network_anomaly (Granularity: One row per confirmed network test failure/anomaly. Measures: dns_anomaly_flag, tcp_anomaly_flag, tls_anomaly_flag, http_anomaly_flag, response_latency_ms).</w:t>
         <w:br/>
-        <w:t>• Dimension Tables: dim_country_region, dim_isp_telecom, dim_content_category, dim_date_time.</w:t>
-      </w:r>
-      <w:r>
+        <w:t>• Dimension Tables: dim_country_region (press_freedom_index_tier), dim_isp_telecom (ownership_type), dim_content_category (legal_risk_tier), dim_date_time (day_of_week, is_weekend).</w:t>
         <w:br/>
-        <w:t>• Aggregated Gold Mart: agg_daily_censorship_severity (Precomputed rollups calculating the Censorship Aggression Index: (Total Tampered Tests / Total Tests Conducted) * 100, sliced by country, ASN, category, and date).</w:t>
+        <w:t>• Aggregated Gold Mart: agg_daily_censorship_severity (Precomputed rollups calculating the Censorship Aggression Index (CAI): (Total Tampered Tests / Total Tests Conducted) * 100, sliced by country, ASN, category, and date).</w:t>
       </w:r>
     </w:p>
     <w:p>
@@ -1566,6 +1566,59 @@
           <w:sz w:val="24"/>
         </w:rPr>
         <w:t>5.2 Dashboard Specifications (Power BI / Tableau)</w:t>
+      </w:r>
+    </w:p>
+    <w:p>
+      <w:pPr>
+        <w:jc w:val="center"/>
+      </w:pPr>
+      <w:r>
+        <w:drawing>
+          <wp:inline xmlns:a="http://schemas.openxmlformats.org/drawingml/2006/main" xmlns:pic="http://schemas.openxmlformats.org/drawingml/2006/picture">
+            <wp:extent cx="5669280" cy="4319856"/>
+            <wp:docPr id="3" name="Picture 3"/>
+            <wp:cNvGraphicFramePr>
+              <a:graphicFrameLocks noChangeAspect="1"/>
+            </wp:cNvGraphicFramePr>
+            <a:graphic>
+              <a:graphicData uri="http://schemas.openxmlformats.org/drawingml/2006/picture">
+                <pic:pic>
+                  <pic:nvPicPr>
+                    <pic:cNvPr id="0" name="dashboard_mockup.png"/>
+                    <pic:cNvPicPr/>
+                  </pic:nvPicPr>
+                  <pic:blipFill>
+                    <a:blip r:embed="rId10"/>
+                    <a:stretch>
+                      <a:fillRect/>
+                    </a:stretch>
+                  </pic:blipFill>
+                  <pic:spPr>
+                    <a:xfrm>
+                      <a:off x="0" y="0"/>
+                      <a:ext cx="5669280" cy="4319856"/>
+                    </a:xfrm>
+                    <a:prstGeom prst="rect"/>
+                  </pic:spPr>
+                </pic:pic>
+              </a:graphicData>
+            </a:graphic>
+          </wp:inline>
+        </w:drawing>
+      </w:r>
+    </w:p>
+    <w:p>
+      <w:pPr>
+        <w:jc w:val="center"/>
+      </w:pPr>
+      <w:r>
+        <w:rPr>
+          <w:rFonts w:ascii="Calibri" w:hAnsi="Calibri"/>
+          <w:i/>
+          <w:color w:val="64748B"/>
+          <w:sz w:val="19"/>
+        </w:rPr>
+        <w:t>Figure 3: Panopticon Executive Watchtower Command Center Mockup (Power BI / Tableau)</w:t>
       </w:r>
     </w:p>
     <w:p>
@@ -1868,912 +1921,90 @@
               <w:bottom w:w="100" w:type="dxa"/>
               <w:right w:w="140" w:type="dxa"/>
             </w:tcMar>
+            <w:shd w:fill="F1F5F9"/>
           </w:tcPr>
           <w:p>
             <w:pPr>
-              <w:spacing w:after="0" w:line="252" w:lineRule="auto"/>
-              <w:rPr>
-                <w:rFonts w:ascii="Consolas" w:hAnsi="Consolas"/>
-                <w:sz w:val="17"/>
-              </w:rPr>
+              <w:spacing w:before="80" w:after="80"/>
             </w:pPr>
             <w:r>
               <w:rPr>
                 <w:rFonts w:ascii="Consolas" w:hAnsi="Consolas"/>
+                <w:color w:val="0F172A"/>
                 <w:sz w:val="17"/>
               </w:rPr>
-              <w:t>project-panopticon-</w:t>
+              <w:t>Project-Panopticon/</w:t>
+              <w:br/>
+              <w:t>├── README.md                              # Comprehensive Project Documentation &amp; Architecture</w:t>
+              <w:br/>
+              <w:t>├── LICENSE                                # MIT License</w:t>
+              <w:br/>
+              <w:t>├── Docs/</w:t>
+              <w:br/>
+              <w:t>│   ├── Phase 1/</w:t>
+              <w:br/>
+              <w:t>│   │   └── phase1_proposal.md             # Formal Project Proposal Document</w:t>
+              <w:br/>
+              <w:t>│   ├── Phase 2/</w:t>
+              <w:br/>
+              <w:t>│   │   ├── phase2_implementation_plan.md  # Core Ingestion &amp; Transformation Plan</w:t>
+              <w:br/>
+              <w:t>│   │   ├── 06_data_dictionary.md          # Enterprise Data Dictionary (Bronze/Silver/Gold)</w:t>
+              <w:br/>
+              <w:t>│   │   └── 07_execution_guide.md          # Parameterized Backfill &amp; Execution Guide</w:t>
+              <w:br/>
+              <w:t>│   ├── .docx/</w:t>
+              <w:br/>
+              <w:t>│   │   └── phase1_proposal.docx           # Executive Word Document Version</w:t>
+              <w:br/>
+              <w:t>│   ├── Future &amp; Reference/</w:t>
+              <w:br/>
+              <w:t>│   │   ├── 01_architectures_and_tech_stacks.md # Architecture &amp; Tech Stack Evaluation</w:t>
+              <w:br/>
+              <w:t>│   │   ├── 02_phased_implementation_and_work_division.md # Team Roles &amp; Sprints</w:t>
+              <w:br/>
+              <w:t>│   │   ├── 03_core_data_engineering_curriculum.md # 8 Core DE Superpowers</w:t>
+              <w:br/>
+              <w:t>│   │   ├── 04_interview_guide_and_academic_defense.md # Technical Interview &amp; Defense Guide</w:t>
+              <w:br/>
+              <w:t>│   │   └── 05_deployment_guide_and_troubleshooting.md # Operations Manual &amp; OOM Mitigation</w:t>
+              <w:br/>
+              <w:t>│   └── assets/                            # Visual architecture &amp; schema artifacts</w:t>
+              <w:br/>
+              <w:t>│       ├── architecture_diagram.png       # High-resolution Lakehouse Architecture</w:t>
+              <w:br/>
+              <w:t>│       ├── star_schema_diagram.png        # Dimensional Star Schema Entity Diagram</w:t>
+              <w:br/>
+              <w:t>│       └── dashboard_mockup.png           # Power BI / Tableau Watchtower Command Center</w:t>
+              <w:br/>
+              <w:t>├── data/</w:t>
+              <w:br/>
+              <w:t>│   ├── samples/                           # Version-controlled sample payloads</w:t>
+              <w:br/>
+              <w:t>│   │   ├── sample_full_load_ooni.json     # Baseline probe telemetry fixture</w:t>
+              <w:br/>
+              <w:t>│   │   ├── sample_incremental_ooni.json  # Daily delta telemetry fixture</w:t>
+              <w:br/>
+              <w:t>│   │   └── sample_citizenlab_categories.csv # URL classification taxonomy</w:t>
+              <w:br/>
+              <w:t>│   └── schemas/                           # Strict JSON schema contracts</w:t>
+              <w:br/>
+              <w:t>│       ├── bronze_ooni_schema.json        # Raw telemetry schema-on-read contract</w:t>
+              <w:br/>
+              <w:t>│       └── silver_conformed_schema.json   # Enriched, PII-scrubbed schema contract</w:t>
+              <w:br/>
+              <w:t>├── notebooks/                             # PySpark distributed processing notebooks</w:t>
+              <w:br/>
+              <w:t>│   ├── 01_bronze_ingestion.py             # Schema-on-read ingestion + quarantine + metadata</w:t>
+              <w:br/>
+              <w:t>│   ├── 02_silver_transformation.py        # PII masking, array flattening &amp; Delta MERGE</w:t>
+              <w:br/>
+              <w:t>│   ├── 03_gold_dimensional_modeling.py   # Star Schema dimensional modeling &amp; rollups</w:t>
+              <w:br/>
+              <w:t>│   └── run_pipeline.py                    # Parameterized runner (Incremental vs Backfill)</w:t>
+              <w:br/>
+              <w:t>└── panopticon_adversarial_review.md       # Production Feasibility &amp; FinOps Stress Test</w:t>
             </w:r>
-            <w:proofErr w:type="spellStart"/>
-            <w:r>
-              <w:rPr>
-                <w:rFonts w:ascii="Consolas" w:hAnsi="Consolas"/>
-                <w:sz w:val="17"/>
-              </w:rPr>
-              <w:t>lakehouse</w:t>
-            </w:r>
-            <w:proofErr w:type="spellEnd"/>
-            <w:r>
-              <w:rPr>
-                <w:rFonts w:ascii="Consolas" w:hAnsi="Consolas"/>
-                <w:sz w:val="17"/>
-              </w:rPr>
-              <w:t>/</w:t>
-            </w:r>
-          </w:p>
-          <w:p>
-            <w:pPr>
-              <w:spacing w:after="0" w:line="252" w:lineRule="auto"/>
-              <w:rPr>
-                <w:rFonts w:ascii="Consolas" w:hAnsi="Consolas" w:hint="eastAsia"/>
-                <w:sz w:val="17"/>
-              </w:rPr>
-            </w:pPr>
-            <w:r>
-              <w:rPr>
-                <w:rFonts w:ascii="Consolas" w:hAnsi="Consolas" w:hint="eastAsia"/>
-                <w:sz w:val="17"/>
-              </w:rPr>
-              <w:t>├──</w:t>
-            </w:r>
-            <w:r>
-              <w:rPr>
-                <w:rFonts w:ascii="Consolas" w:hAnsi="Consolas" w:hint="eastAsia"/>
-                <w:sz w:val="17"/>
-              </w:rPr>
-              <w:t xml:space="preserve"> README.md</w:t>
-            </w:r>
-          </w:p>
-          <w:p>
-            <w:pPr>
-              <w:spacing w:after="0" w:line="252" w:lineRule="auto"/>
-              <w:rPr>
-                <w:rFonts w:ascii="Consolas" w:hAnsi="Consolas" w:hint="eastAsia"/>
-                <w:sz w:val="17"/>
-              </w:rPr>
-            </w:pPr>
-            <w:r>
-              <w:rPr>
-                <w:rFonts w:ascii="Consolas" w:hAnsi="Consolas" w:hint="eastAsia"/>
-                <w:sz w:val="17"/>
-              </w:rPr>
-              <w:t>├──</w:t>
-            </w:r>
-            <w:r>
-              <w:rPr>
-                <w:rFonts w:ascii="Consolas" w:hAnsi="Consolas" w:hint="eastAsia"/>
-                <w:sz w:val="17"/>
-              </w:rPr>
-              <w:t xml:space="preserve"> LICENSE</w:t>
-            </w:r>
-          </w:p>
-          <w:p>
-            <w:pPr>
-              <w:spacing w:after="0" w:line="252" w:lineRule="auto"/>
-              <w:rPr>
-                <w:rFonts w:ascii="Consolas" w:hAnsi="Consolas" w:hint="eastAsia"/>
-                <w:sz w:val="17"/>
-              </w:rPr>
-            </w:pPr>
-            <w:r>
-              <w:rPr>
-                <w:rFonts w:ascii="Consolas" w:hAnsi="Consolas" w:hint="eastAsia"/>
-                <w:sz w:val="17"/>
-              </w:rPr>
-              <w:t>├──</w:t>
-            </w:r>
-            <w:r>
-              <w:rPr>
-                <w:rFonts w:ascii="Consolas" w:hAnsi="Consolas" w:hint="eastAsia"/>
-                <w:sz w:val="17"/>
-              </w:rPr>
-              <w:t xml:space="preserve"> docs/</w:t>
-            </w:r>
-          </w:p>
-          <w:p>
-            <w:pPr>
-              <w:spacing w:after="0" w:line="252" w:lineRule="auto"/>
-              <w:rPr>
-                <w:rFonts w:ascii="Consolas" w:hAnsi="Consolas" w:hint="eastAsia"/>
-                <w:sz w:val="17"/>
-              </w:rPr>
-            </w:pPr>
-            <w:r>
-              <w:rPr>
-                <w:rFonts w:ascii="Consolas" w:hAnsi="Consolas" w:hint="eastAsia"/>
-                <w:sz w:val="17"/>
-              </w:rPr>
-              <w:t>│</w:t>
-            </w:r>
-            <w:r>
-              <w:rPr>
-                <w:rFonts w:ascii="Consolas" w:hAnsi="Consolas" w:hint="eastAsia"/>
-                <w:sz w:val="17"/>
-              </w:rPr>
-              <w:t xml:space="preserve">   </w:t>
-            </w:r>
-            <w:r>
-              <w:rPr>
-                <w:rFonts w:ascii="Consolas" w:hAnsi="Consolas" w:hint="eastAsia"/>
-                <w:sz w:val="17"/>
-              </w:rPr>
-              <w:t>├──</w:t>
-            </w:r>
-            <w:r>
-              <w:rPr>
-                <w:rFonts w:ascii="Consolas" w:hAnsi="Consolas" w:hint="eastAsia"/>
-                <w:sz w:val="17"/>
-              </w:rPr>
-              <w:t xml:space="preserve"> phase1_proposal.md</w:t>
-            </w:r>
-          </w:p>
-          <w:p>
-            <w:pPr>
-              <w:spacing w:after="0" w:line="252" w:lineRule="auto"/>
-              <w:rPr>
-                <w:rFonts w:ascii="Consolas" w:hAnsi="Consolas" w:hint="eastAsia"/>
-                <w:sz w:val="17"/>
-              </w:rPr>
-            </w:pPr>
-            <w:r>
-              <w:rPr>
-                <w:rFonts w:ascii="Consolas" w:hAnsi="Consolas" w:hint="eastAsia"/>
-                <w:sz w:val="17"/>
-              </w:rPr>
-              <w:t>│</w:t>
-            </w:r>
-            <w:r>
-              <w:rPr>
-                <w:rFonts w:ascii="Consolas" w:hAnsi="Consolas" w:hint="eastAsia"/>
-                <w:sz w:val="17"/>
-              </w:rPr>
-              <w:t xml:space="preserve">   </w:t>
-            </w:r>
-            <w:r>
-              <w:rPr>
-                <w:rFonts w:ascii="Consolas" w:hAnsi="Consolas" w:hint="eastAsia"/>
-                <w:sz w:val="17"/>
-              </w:rPr>
-              <w:t>├──</w:t>
-            </w:r>
-            <w:r>
-              <w:rPr>
-                <w:rFonts w:ascii="Consolas" w:hAnsi="Consolas" w:hint="eastAsia"/>
-                <w:sz w:val="17"/>
-              </w:rPr>
-              <w:t xml:space="preserve"> data_dictionary.md</w:t>
-            </w:r>
-          </w:p>
-          <w:p>
-            <w:pPr>
-              <w:spacing w:after="0" w:line="252" w:lineRule="auto"/>
-              <w:rPr>
-                <w:rFonts w:ascii="Consolas" w:hAnsi="Consolas" w:hint="eastAsia"/>
-                <w:sz w:val="17"/>
-              </w:rPr>
-            </w:pPr>
-            <w:r>
-              <w:rPr>
-                <w:rFonts w:ascii="Consolas" w:hAnsi="Consolas" w:hint="eastAsia"/>
-                <w:sz w:val="17"/>
-              </w:rPr>
-              <w:t>│</w:t>
-            </w:r>
-            <w:r>
-              <w:rPr>
-                <w:rFonts w:ascii="Consolas" w:hAnsi="Consolas" w:hint="eastAsia"/>
-                <w:sz w:val="17"/>
-              </w:rPr>
-              <w:t xml:space="preserve">   </w:t>
-            </w:r>
-            <w:r>
-              <w:rPr>
-                <w:rFonts w:ascii="Consolas" w:hAnsi="Consolas" w:hint="eastAsia"/>
-                <w:sz w:val="17"/>
-              </w:rPr>
-              <w:t>└──</w:t>
-            </w:r>
-            <w:r>
-              <w:rPr>
-                <w:rFonts w:ascii="Consolas" w:hAnsi="Consolas" w:hint="eastAsia"/>
-                <w:sz w:val="17"/>
-              </w:rPr>
-              <w:t xml:space="preserve"> architecture_diagram.png</w:t>
-            </w:r>
-          </w:p>
-          <w:p>
-            <w:pPr>
-              <w:spacing w:after="0" w:line="252" w:lineRule="auto"/>
-              <w:rPr>
-                <w:rFonts w:ascii="Consolas" w:hAnsi="Consolas" w:hint="eastAsia"/>
-                <w:sz w:val="17"/>
-              </w:rPr>
-            </w:pPr>
-            <w:r>
-              <w:rPr>
-                <w:rFonts w:ascii="Consolas" w:hAnsi="Consolas" w:hint="eastAsia"/>
-                <w:sz w:val="17"/>
-              </w:rPr>
-              <w:t>├──</w:t>
-            </w:r>
-            <w:r>
-              <w:rPr>
-                <w:rFonts w:ascii="Consolas" w:hAnsi="Consolas" w:hint="eastAsia"/>
-                <w:sz w:val="17"/>
-              </w:rPr>
-              <w:t xml:space="preserve"> data/</w:t>
-            </w:r>
-          </w:p>
-          <w:p>
-            <w:pPr>
-              <w:spacing w:after="0" w:line="252" w:lineRule="auto"/>
-              <w:rPr>
-                <w:rFonts w:ascii="Consolas" w:hAnsi="Consolas" w:hint="eastAsia"/>
-                <w:sz w:val="17"/>
-              </w:rPr>
-            </w:pPr>
-            <w:r>
-              <w:rPr>
-                <w:rFonts w:ascii="Consolas" w:hAnsi="Consolas" w:hint="eastAsia"/>
-                <w:sz w:val="17"/>
-              </w:rPr>
-              <w:t>│</w:t>
-            </w:r>
-            <w:r>
-              <w:rPr>
-                <w:rFonts w:ascii="Consolas" w:hAnsi="Consolas" w:hint="eastAsia"/>
-                <w:sz w:val="17"/>
-              </w:rPr>
-              <w:t xml:space="preserve">   </w:t>
-            </w:r>
-            <w:r>
-              <w:rPr>
-                <w:rFonts w:ascii="Consolas" w:hAnsi="Consolas" w:hint="eastAsia"/>
-                <w:sz w:val="17"/>
-              </w:rPr>
-              <w:t>├──</w:t>
-            </w:r>
-            <w:r>
-              <w:rPr>
-                <w:rFonts w:ascii="Consolas" w:hAnsi="Consolas" w:hint="eastAsia"/>
-                <w:sz w:val="17"/>
-              </w:rPr>
-              <w:t xml:space="preserve"> samples/</w:t>
-            </w:r>
-          </w:p>
-          <w:p>
-            <w:pPr>
-              <w:spacing w:after="0" w:line="252" w:lineRule="auto"/>
-              <w:rPr>
-                <w:rFonts w:ascii="Consolas" w:hAnsi="Consolas" w:hint="eastAsia"/>
-                <w:sz w:val="17"/>
-              </w:rPr>
-            </w:pPr>
-            <w:r>
-              <w:rPr>
-                <w:rFonts w:ascii="Consolas" w:hAnsi="Consolas" w:hint="eastAsia"/>
-                <w:sz w:val="17"/>
-              </w:rPr>
-              <w:t>│</w:t>
-            </w:r>
-            <w:r>
-              <w:rPr>
-                <w:rFonts w:ascii="Consolas" w:hAnsi="Consolas" w:hint="eastAsia"/>
-                <w:sz w:val="17"/>
-              </w:rPr>
-              <w:t xml:space="preserve">   </w:t>
-            </w:r>
-            <w:r>
-              <w:rPr>
-                <w:rFonts w:ascii="Consolas" w:hAnsi="Consolas" w:hint="eastAsia"/>
-                <w:sz w:val="17"/>
-              </w:rPr>
-              <w:t>│</w:t>
-            </w:r>
-            <w:r>
-              <w:rPr>
-                <w:rFonts w:ascii="Consolas" w:hAnsi="Consolas" w:hint="eastAsia"/>
-                <w:sz w:val="17"/>
-              </w:rPr>
-              <w:t xml:space="preserve">   </w:t>
-            </w:r>
-            <w:r>
-              <w:rPr>
-                <w:rFonts w:ascii="Consolas" w:hAnsi="Consolas" w:hint="eastAsia"/>
-                <w:sz w:val="17"/>
-              </w:rPr>
-              <w:t>├──</w:t>
-            </w:r>
-            <w:r>
-              <w:rPr>
-                <w:rFonts w:ascii="Consolas" w:hAnsi="Consolas" w:hint="eastAsia"/>
-                <w:sz w:val="17"/>
-              </w:rPr>
-              <w:t xml:space="preserve"> </w:t>
-            </w:r>
-            <w:proofErr w:type="spellStart"/>
-            <w:r>
-              <w:rPr>
-                <w:rFonts w:ascii="Consolas" w:hAnsi="Consolas" w:hint="eastAsia"/>
-                <w:sz w:val="17"/>
-              </w:rPr>
-              <w:t>sample_full_load_</w:t>
-            </w:r>
-            <w:proofErr w:type="gramStart"/>
-            <w:r>
-              <w:rPr>
-                <w:rFonts w:ascii="Consolas" w:hAnsi="Consolas" w:hint="eastAsia"/>
-                <w:sz w:val="17"/>
-              </w:rPr>
-              <w:t>ooni.json</w:t>
-            </w:r>
-            <w:proofErr w:type="spellEnd"/>
-            <w:proofErr w:type="gramEnd"/>
-          </w:p>
-          <w:p>
-            <w:pPr>
-              <w:spacing w:after="0" w:line="252" w:lineRule="auto"/>
-              <w:rPr>
-                <w:rFonts w:ascii="Consolas" w:hAnsi="Consolas" w:hint="eastAsia"/>
-                <w:sz w:val="17"/>
-              </w:rPr>
-            </w:pPr>
-            <w:r>
-              <w:rPr>
-                <w:rFonts w:ascii="Consolas" w:hAnsi="Consolas" w:hint="eastAsia"/>
-                <w:sz w:val="17"/>
-              </w:rPr>
-              <w:t>│</w:t>
-            </w:r>
-            <w:r>
-              <w:rPr>
-                <w:rFonts w:ascii="Consolas" w:hAnsi="Consolas" w:hint="eastAsia"/>
-                <w:sz w:val="17"/>
-              </w:rPr>
-              <w:t xml:space="preserve">   </w:t>
-            </w:r>
-            <w:r>
-              <w:rPr>
-                <w:rFonts w:ascii="Consolas" w:hAnsi="Consolas" w:hint="eastAsia"/>
-                <w:sz w:val="17"/>
-              </w:rPr>
-              <w:t>│</w:t>
-            </w:r>
-            <w:r>
-              <w:rPr>
-                <w:rFonts w:ascii="Consolas" w:hAnsi="Consolas" w:hint="eastAsia"/>
-                <w:sz w:val="17"/>
-              </w:rPr>
-              <w:t xml:space="preserve">   </w:t>
-            </w:r>
-            <w:r>
-              <w:rPr>
-                <w:rFonts w:ascii="Consolas" w:hAnsi="Consolas" w:hint="eastAsia"/>
-                <w:sz w:val="17"/>
-              </w:rPr>
-              <w:t>├──</w:t>
-            </w:r>
-            <w:r>
-              <w:rPr>
-                <w:rFonts w:ascii="Consolas" w:hAnsi="Consolas" w:hint="eastAsia"/>
-                <w:sz w:val="17"/>
-              </w:rPr>
-              <w:t xml:space="preserve"> </w:t>
-            </w:r>
-            <w:proofErr w:type="spellStart"/>
-            <w:r>
-              <w:rPr>
-                <w:rFonts w:ascii="Consolas" w:hAnsi="Consolas" w:hint="eastAsia"/>
-                <w:sz w:val="17"/>
-              </w:rPr>
-              <w:t>sample_incremental_</w:t>
-            </w:r>
-            <w:proofErr w:type="gramStart"/>
-            <w:r>
-              <w:rPr>
-                <w:rFonts w:ascii="Consolas" w:hAnsi="Consolas" w:hint="eastAsia"/>
-                <w:sz w:val="17"/>
-              </w:rPr>
-              <w:t>ooni.json</w:t>
-            </w:r>
-            <w:proofErr w:type="spellEnd"/>
-            <w:proofErr w:type="gramEnd"/>
-          </w:p>
-          <w:p>
-            <w:pPr>
-              <w:spacing w:after="0" w:line="252" w:lineRule="auto"/>
-              <w:rPr>
-                <w:rFonts w:ascii="Consolas" w:hAnsi="Consolas" w:hint="eastAsia"/>
-                <w:sz w:val="17"/>
-              </w:rPr>
-            </w:pPr>
-            <w:r>
-              <w:rPr>
-                <w:rFonts w:ascii="Consolas" w:hAnsi="Consolas" w:hint="eastAsia"/>
-                <w:sz w:val="17"/>
-              </w:rPr>
-              <w:t>│</w:t>
-            </w:r>
-            <w:r>
-              <w:rPr>
-                <w:rFonts w:ascii="Consolas" w:hAnsi="Consolas" w:hint="eastAsia"/>
-                <w:sz w:val="17"/>
-              </w:rPr>
-              <w:t xml:space="preserve">   </w:t>
-            </w:r>
-            <w:r>
-              <w:rPr>
-                <w:rFonts w:ascii="Consolas" w:hAnsi="Consolas" w:hint="eastAsia"/>
-                <w:sz w:val="17"/>
-              </w:rPr>
-              <w:t>│</w:t>
-            </w:r>
-            <w:r>
-              <w:rPr>
-                <w:rFonts w:ascii="Consolas" w:hAnsi="Consolas" w:hint="eastAsia"/>
-                <w:sz w:val="17"/>
-              </w:rPr>
-              <w:t xml:space="preserve">   </w:t>
-            </w:r>
-            <w:r>
-              <w:rPr>
-                <w:rFonts w:ascii="Consolas" w:hAnsi="Consolas" w:hint="eastAsia"/>
-                <w:sz w:val="17"/>
-              </w:rPr>
-              <w:t>└──</w:t>
-            </w:r>
-            <w:r>
-              <w:rPr>
-                <w:rFonts w:ascii="Consolas" w:hAnsi="Consolas" w:hint="eastAsia"/>
-                <w:sz w:val="17"/>
-              </w:rPr>
-              <w:t xml:space="preserve"> sample_citizenlab_categories.csv</w:t>
-            </w:r>
-          </w:p>
-          <w:p>
-            <w:pPr>
-              <w:spacing w:after="0" w:line="252" w:lineRule="auto"/>
-              <w:rPr>
-                <w:rFonts w:ascii="Consolas" w:hAnsi="Consolas" w:hint="eastAsia"/>
-                <w:sz w:val="17"/>
-              </w:rPr>
-            </w:pPr>
-            <w:r>
-              <w:rPr>
-                <w:rFonts w:ascii="Consolas" w:hAnsi="Consolas" w:hint="eastAsia"/>
-                <w:sz w:val="17"/>
-              </w:rPr>
-              <w:t>│</w:t>
-            </w:r>
-            <w:r>
-              <w:rPr>
-                <w:rFonts w:ascii="Consolas" w:hAnsi="Consolas" w:hint="eastAsia"/>
-                <w:sz w:val="17"/>
-              </w:rPr>
-              <w:t xml:space="preserve">   </w:t>
-            </w:r>
-            <w:r>
-              <w:rPr>
-                <w:rFonts w:ascii="Consolas" w:hAnsi="Consolas" w:hint="eastAsia"/>
-                <w:sz w:val="17"/>
-              </w:rPr>
-              <w:t>└──</w:t>
-            </w:r>
-            <w:r>
-              <w:rPr>
-                <w:rFonts w:ascii="Consolas" w:hAnsi="Consolas" w:hint="eastAsia"/>
-                <w:sz w:val="17"/>
-              </w:rPr>
-              <w:t xml:space="preserve"> schemas/</w:t>
-            </w:r>
-          </w:p>
-          <w:p>
-            <w:pPr>
-              <w:spacing w:after="0" w:line="252" w:lineRule="auto"/>
-              <w:rPr>
-                <w:rFonts w:ascii="Consolas" w:hAnsi="Consolas" w:hint="eastAsia"/>
-                <w:sz w:val="17"/>
-              </w:rPr>
-            </w:pPr>
-            <w:r>
-              <w:rPr>
-                <w:rFonts w:ascii="Consolas" w:hAnsi="Consolas" w:hint="eastAsia"/>
-                <w:sz w:val="17"/>
-              </w:rPr>
-              <w:t>│</w:t>
-            </w:r>
-            <w:r>
-              <w:rPr>
-                <w:rFonts w:ascii="Consolas" w:hAnsi="Consolas" w:hint="eastAsia"/>
-                <w:sz w:val="17"/>
-              </w:rPr>
-              <w:t xml:space="preserve">       </w:t>
-            </w:r>
-            <w:r>
-              <w:rPr>
-                <w:rFonts w:ascii="Consolas" w:hAnsi="Consolas" w:hint="eastAsia"/>
-                <w:sz w:val="17"/>
-              </w:rPr>
-              <w:t>├──</w:t>
-            </w:r>
-            <w:r>
-              <w:rPr>
-                <w:rFonts w:ascii="Consolas" w:hAnsi="Consolas" w:hint="eastAsia"/>
-                <w:sz w:val="17"/>
-              </w:rPr>
-              <w:t xml:space="preserve"> </w:t>
-            </w:r>
-            <w:proofErr w:type="spellStart"/>
-            <w:r>
-              <w:rPr>
-                <w:rFonts w:ascii="Consolas" w:hAnsi="Consolas" w:hint="eastAsia"/>
-                <w:sz w:val="17"/>
-              </w:rPr>
-              <w:t>bronze_ooni_</w:t>
-            </w:r>
-            <w:proofErr w:type="gramStart"/>
-            <w:r>
-              <w:rPr>
-                <w:rFonts w:ascii="Consolas" w:hAnsi="Consolas" w:hint="eastAsia"/>
-                <w:sz w:val="17"/>
-              </w:rPr>
-              <w:t>schema.json</w:t>
-            </w:r>
-            <w:proofErr w:type="spellEnd"/>
-            <w:proofErr w:type="gramEnd"/>
-          </w:p>
-          <w:p>
-            <w:pPr>
-              <w:spacing w:after="0" w:line="252" w:lineRule="auto"/>
-              <w:rPr>
-                <w:rFonts w:ascii="Consolas" w:hAnsi="Consolas" w:hint="eastAsia"/>
-                <w:sz w:val="17"/>
-              </w:rPr>
-            </w:pPr>
-            <w:r>
-              <w:rPr>
-                <w:rFonts w:ascii="Consolas" w:hAnsi="Consolas" w:hint="eastAsia"/>
-                <w:sz w:val="17"/>
-              </w:rPr>
-              <w:t>│</w:t>
-            </w:r>
-            <w:r>
-              <w:rPr>
-                <w:rFonts w:ascii="Consolas" w:hAnsi="Consolas" w:hint="eastAsia"/>
-                <w:sz w:val="17"/>
-              </w:rPr>
-              <w:t xml:space="preserve">       </w:t>
-            </w:r>
-            <w:r>
-              <w:rPr>
-                <w:rFonts w:ascii="Consolas" w:hAnsi="Consolas" w:hint="eastAsia"/>
-                <w:sz w:val="17"/>
-              </w:rPr>
-              <w:t>└──</w:t>
-            </w:r>
-            <w:r>
-              <w:rPr>
-                <w:rFonts w:ascii="Consolas" w:hAnsi="Consolas" w:hint="eastAsia"/>
-                <w:sz w:val="17"/>
-              </w:rPr>
-              <w:t xml:space="preserve"> </w:t>
-            </w:r>
-            <w:proofErr w:type="spellStart"/>
-            <w:r>
-              <w:rPr>
-                <w:rFonts w:ascii="Consolas" w:hAnsi="Consolas" w:hint="eastAsia"/>
-                <w:sz w:val="17"/>
-              </w:rPr>
-              <w:t>silver_conformed_</w:t>
-            </w:r>
-            <w:proofErr w:type="gramStart"/>
-            <w:r>
-              <w:rPr>
-                <w:rFonts w:ascii="Consolas" w:hAnsi="Consolas" w:hint="eastAsia"/>
-                <w:sz w:val="17"/>
-              </w:rPr>
-              <w:t>schema.json</w:t>
-            </w:r>
-            <w:proofErr w:type="spellEnd"/>
-            <w:proofErr w:type="gramEnd"/>
-          </w:p>
-          <w:p>
-            <w:pPr>
-              <w:spacing w:after="0" w:line="252" w:lineRule="auto"/>
-              <w:rPr>
-                <w:rFonts w:ascii="Consolas" w:hAnsi="Consolas" w:hint="eastAsia"/>
-                <w:sz w:val="17"/>
-              </w:rPr>
-            </w:pPr>
-            <w:r>
-              <w:rPr>
-                <w:rFonts w:ascii="Consolas" w:hAnsi="Consolas" w:hint="eastAsia"/>
-                <w:sz w:val="17"/>
-              </w:rPr>
-              <w:t>├──</w:t>
-            </w:r>
-            <w:r>
-              <w:rPr>
-                <w:rFonts w:ascii="Consolas" w:hAnsi="Consolas" w:hint="eastAsia"/>
-                <w:sz w:val="17"/>
-              </w:rPr>
-              <w:t xml:space="preserve"> notebooks/</w:t>
-            </w:r>
-          </w:p>
-          <w:p>
-            <w:pPr>
-              <w:spacing w:after="0" w:line="252" w:lineRule="auto"/>
-              <w:rPr>
-                <w:rFonts w:ascii="Consolas" w:hAnsi="Consolas" w:hint="eastAsia"/>
-                <w:sz w:val="17"/>
-              </w:rPr>
-            </w:pPr>
-            <w:r>
-              <w:rPr>
-                <w:rFonts w:ascii="Consolas" w:hAnsi="Consolas" w:hint="eastAsia"/>
-                <w:sz w:val="17"/>
-              </w:rPr>
-              <w:t>│</w:t>
-            </w:r>
-            <w:r>
-              <w:rPr>
-                <w:rFonts w:ascii="Consolas" w:hAnsi="Consolas" w:hint="eastAsia"/>
-                <w:sz w:val="17"/>
-              </w:rPr>
-              <w:t xml:space="preserve">   </w:t>
-            </w:r>
-            <w:r>
-              <w:rPr>
-                <w:rFonts w:ascii="Consolas" w:hAnsi="Consolas" w:hint="eastAsia"/>
-                <w:sz w:val="17"/>
-              </w:rPr>
-              <w:t>├──</w:t>
-            </w:r>
-            <w:r>
-              <w:rPr>
-                <w:rFonts w:ascii="Consolas" w:hAnsi="Consolas" w:hint="eastAsia"/>
-                <w:sz w:val="17"/>
-              </w:rPr>
-              <w:t xml:space="preserve"> 01_bronze_ingestion_streaming.py</w:t>
-            </w:r>
-          </w:p>
-          <w:p>
-            <w:pPr>
-              <w:spacing w:after="0" w:line="252" w:lineRule="auto"/>
-              <w:rPr>
-                <w:rFonts w:ascii="Consolas" w:hAnsi="Consolas" w:hint="eastAsia"/>
-                <w:sz w:val="17"/>
-              </w:rPr>
-            </w:pPr>
-            <w:r>
-              <w:rPr>
-                <w:rFonts w:ascii="Consolas" w:hAnsi="Consolas" w:hint="eastAsia"/>
-                <w:sz w:val="17"/>
-              </w:rPr>
-              <w:t>│</w:t>
-            </w:r>
-            <w:r>
-              <w:rPr>
-                <w:rFonts w:ascii="Consolas" w:hAnsi="Consolas" w:hint="eastAsia"/>
-                <w:sz w:val="17"/>
-              </w:rPr>
-              <w:t xml:space="preserve">   </w:t>
-            </w:r>
-            <w:r>
-              <w:rPr>
-                <w:rFonts w:ascii="Consolas" w:hAnsi="Consolas" w:hint="eastAsia"/>
-                <w:sz w:val="17"/>
-              </w:rPr>
-              <w:t>├──</w:t>
-            </w:r>
-            <w:r>
-              <w:rPr>
-                <w:rFonts w:ascii="Consolas" w:hAnsi="Consolas" w:hint="eastAsia"/>
-                <w:sz w:val="17"/>
-              </w:rPr>
-              <w:t xml:space="preserve"> 02_silver_cleaning_anonymization.py</w:t>
-            </w:r>
-          </w:p>
-          <w:p>
-            <w:pPr>
-              <w:spacing w:after="0" w:line="252" w:lineRule="auto"/>
-              <w:rPr>
-                <w:rFonts w:ascii="Consolas" w:hAnsi="Consolas" w:hint="eastAsia"/>
-                <w:sz w:val="17"/>
-              </w:rPr>
-            </w:pPr>
-            <w:r>
-              <w:rPr>
-                <w:rFonts w:ascii="Consolas" w:hAnsi="Consolas" w:hint="eastAsia"/>
-                <w:sz w:val="17"/>
-              </w:rPr>
-              <w:t>│</w:t>
-            </w:r>
-            <w:r>
-              <w:rPr>
-                <w:rFonts w:ascii="Consolas" w:hAnsi="Consolas" w:hint="eastAsia"/>
-                <w:sz w:val="17"/>
-              </w:rPr>
-              <w:t xml:space="preserve">   </w:t>
-            </w:r>
-            <w:r>
-              <w:rPr>
-                <w:rFonts w:ascii="Consolas" w:hAnsi="Consolas" w:hint="eastAsia"/>
-                <w:sz w:val="17"/>
-              </w:rPr>
-              <w:t>└──</w:t>
-            </w:r>
-            <w:r>
-              <w:rPr>
-                <w:rFonts w:ascii="Consolas" w:hAnsi="Consolas" w:hint="eastAsia"/>
-                <w:sz w:val="17"/>
-              </w:rPr>
-              <w:t xml:space="preserve"> 03_gold_dimensional_modeling.py</w:t>
-            </w:r>
-          </w:p>
-          <w:p>
-            <w:pPr>
-              <w:spacing w:after="0" w:line="252" w:lineRule="auto"/>
-              <w:rPr>
-                <w:rFonts w:ascii="Consolas" w:hAnsi="Consolas" w:hint="eastAsia"/>
-                <w:sz w:val="17"/>
-              </w:rPr>
-            </w:pPr>
-            <w:r>
-              <w:rPr>
-                <w:rFonts w:ascii="Consolas" w:hAnsi="Consolas" w:hint="eastAsia"/>
-                <w:sz w:val="17"/>
-              </w:rPr>
-              <w:t>├──</w:t>
-            </w:r>
-            <w:r>
-              <w:rPr>
-                <w:rFonts w:ascii="Consolas" w:hAnsi="Consolas" w:hint="eastAsia"/>
-                <w:sz w:val="17"/>
-              </w:rPr>
-              <w:t xml:space="preserve"> pipelines/</w:t>
-            </w:r>
-          </w:p>
-          <w:p>
-            <w:pPr>
-              <w:spacing w:after="0" w:line="252" w:lineRule="auto"/>
-              <w:rPr>
-                <w:rFonts w:ascii="Consolas" w:hAnsi="Consolas" w:hint="eastAsia"/>
-                <w:sz w:val="17"/>
-              </w:rPr>
-            </w:pPr>
-            <w:r>
-              <w:rPr>
-                <w:rFonts w:ascii="Consolas" w:hAnsi="Consolas" w:hint="eastAsia"/>
-                <w:sz w:val="17"/>
-              </w:rPr>
-              <w:t>│</w:t>
-            </w:r>
-            <w:r>
-              <w:rPr>
-                <w:rFonts w:ascii="Consolas" w:hAnsi="Consolas" w:hint="eastAsia"/>
-                <w:sz w:val="17"/>
-              </w:rPr>
-              <w:t xml:space="preserve">   </w:t>
-            </w:r>
-            <w:r>
-              <w:rPr>
-                <w:rFonts w:ascii="Consolas" w:hAnsi="Consolas" w:hint="eastAsia"/>
-                <w:sz w:val="17"/>
-              </w:rPr>
-              <w:t>├──</w:t>
-            </w:r>
-            <w:r>
-              <w:rPr>
-                <w:rFonts w:ascii="Consolas" w:hAnsi="Consolas" w:hint="eastAsia"/>
-                <w:sz w:val="17"/>
-              </w:rPr>
-              <w:t xml:space="preserve"> incremental_daily_ingest.py</w:t>
-            </w:r>
-          </w:p>
-          <w:p>
-            <w:pPr>
-              <w:spacing w:after="0" w:line="252" w:lineRule="auto"/>
-              <w:rPr>
-                <w:rFonts w:ascii="Consolas" w:hAnsi="Consolas" w:hint="eastAsia"/>
-                <w:sz w:val="17"/>
-              </w:rPr>
-            </w:pPr>
-            <w:r>
-              <w:rPr>
-                <w:rFonts w:ascii="Consolas" w:hAnsi="Consolas" w:hint="eastAsia"/>
-                <w:sz w:val="17"/>
-              </w:rPr>
-              <w:t>│</w:t>
-            </w:r>
-            <w:r>
-              <w:rPr>
-                <w:rFonts w:ascii="Consolas" w:hAnsi="Consolas" w:hint="eastAsia"/>
-                <w:sz w:val="17"/>
-              </w:rPr>
-              <w:t xml:space="preserve">   </w:t>
-            </w:r>
-            <w:r>
-              <w:rPr>
-                <w:rFonts w:ascii="Consolas" w:hAnsi="Consolas" w:hint="eastAsia"/>
-                <w:sz w:val="17"/>
-              </w:rPr>
-              <w:t>└──</w:t>
-            </w:r>
-            <w:r>
-              <w:rPr>
-                <w:rFonts w:ascii="Consolas" w:hAnsi="Consolas" w:hint="eastAsia"/>
-                <w:sz w:val="17"/>
-              </w:rPr>
-              <w:t xml:space="preserve"> delta_maintenance_vacuum.py</w:t>
-            </w:r>
-          </w:p>
-          <w:p>
-            <w:pPr>
-              <w:spacing w:after="0" w:line="252" w:lineRule="auto"/>
-              <w:rPr>
-                <w:rFonts w:ascii="Consolas" w:hAnsi="Consolas" w:hint="eastAsia"/>
-                <w:sz w:val="17"/>
-              </w:rPr>
-            </w:pPr>
-            <w:r>
-              <w:rPr>
-                <w:rFonts w:ascii="Consolas" w:hAnsi="Consolas" w:hint="eastAsia"/>
-                <w:sz w:val="17"/>
-              </w:rPr>
-              <w:t>└──</w:t>
-            </w:r>
-            <w:r>
-              <w:rPr>
-                <w:rFonts w:ascii="Consolas" w:hAnsi="Consolas" w:hint="eastAsia"/>
-                <w:sz w:val="17"/>
-              </w:rPr>
-              <w:t xml:space="preserve"> configs/</w:t>
-            </w:r>
-          </w:p>
-          <w:p>
-            <w:pPr>
-              <w:spacing w:after="0" w:line="252" w:lineRule="auto"/>
-            </w:pPr>
-            <w:r>
-              <w:rPr>
-                <w:rFonts w:ascii="Consolas" w:hAnsi="Consolas" w:hint="eastAsia"/>
-                <w:sz w:val="17"/>
-              </w:rPr>
-              <w:t xml:space="preserve">    </w:t>
-            </w:r>
-            <w:r>
-              <w:rPr>
-                <w:rFonts w:ascii="Consolas" w:hAnsi="Consolas" w:hint="eastAsia"/>
-                <w:sz w:val="17"/>
-              </w:rPr>
-              <w:t>└──</w:t>
-            </w:r>
-            <w:r>
-              <w:rPr>
-                <w:rFonts w:ascii="Consolas" w:hAnsi="Consolas" w:hint="eastAsia"/>
-                <w:sz w:val="17"/>
-              </w:rPr>
-              <w:t xml:space="preserve"> </w:t>
-            </w:r>
-            <w:proofErr w:type="spellStart"/>
-            <w:r>
-              <w:rPr>
-                <w:rFonts w:ascii="Consolas" w:hAnsi="Consolas" w:hint="eastAsia"/>
-                <w:sz w:val="17"/>
-              </w:rPr>
-              <w:t>spark_cluster_</w:t>
-            </w:r>
-            <w:proofErr w:type="gramStart"/>
-            <w:r>
-              <w:rPr>
-                <w:rFonts w:ascii="Consolas" w:hAnsi="Consolas" w:hint="eastAsia"/>
-                <w:sz w:val="17"/>
-              </w:rPr>
-              <w:t>config.yaml</w:t>
-            </w:r>
-            <w:proofErr w:type="spellEnd"/>
-            <w:proofErr w:type="gramEnd"/>
           </w:p>
         </w:tc>
       </w:tr>
@@ -2800,26 +2031,14 @@
     <w:p>
       <w:r>
         <w:t>Because execution is hosted on Databricks Community Edition (1 node, 15 GB RAM, 2 vCPUs) or Azure for Students ($100 annual credit ceiling), resource management is an active engineering priority:</w:t>
-      </w:r>
-      <w:r>
         <w:br/>
         <w:t>1. Shuffle Partition Management: Default Apache Spark instantiates 200 shuffle partitions for joins and aggregations, creating severe context switching and memory allocation overhead on a single-node cluster. We configure spark.conf.set("spark.sql.shuffle.partitions", "16") to balance CPU core utilization.</w:t>
-      </w:r>
-      <w:r>
         <w:br/>
-        <w:t>2. Delta Lake File Compaction &amp; Z-Ordering: Automated compaction and multidimensional clustering (OPTIMIZE silver_network_incidents ZORDER BY (country_code, measurement_date, asn_id)) eliminate metadata overhead from small files.</w:t>
-      </w:r>
-      <w:r>
+        <w:t>2. Delta Lake File Compaction &amp; Z-Ordering: Automated compaction and multidimensional clustering (OPTIMIZE silver_network_measurements ZORDER BY (probe_cc, measurement_date, probe_asn)) eliminate metadata overhead from small files.</w:t>
         <w:br/>
-        <w:t xml:space="preserve">3. Storage Retention &amp; Vacuum Policies: Historical snapshots pruned with VACUUM RETAIN 7 DAYS to </w:t>
-      </w:r>
-      <w:r>
-        <w:lastRenderedPageBreak/>
-        <w:t>avoid disk quota exhaustion.</w:t>
-      </w:r>
-      <w:r>
+        <w:t>3. Storage Retention &amp; Vacuum Policies: Historical snapshots pruned with VACUUM silver_network_measurements RETAIN 7 DAYS to avoid disk quota exhaustion.</w:t>
         <w:br/>
-        <w:t>4. Cloud Compute Lifecycle: Azure Databricks clusters enforce Auto-Termination at 15 minutes of inactivity to prevent accidental credit loss.</w:t>
+        <w:t>4. Cloud Compute Lifecycle: Databricks Community Edition clusters automatically terminate after 120 minutes (2 hours) of inactivity (fixed platform policy; pipeline runs are scoped to &lt; 30 minutes). Azure Databricks clusters enforce Auto-Termination at 15 minutes of inactivity to prevent accidental credit loss.</w:t>
       </w:r>
     </w:p>
     <w:p>

</xml_diff>